<commit_message>
Reorganize site by role: producer, liveops, game-designer, brse
Source: Downloads/drive-updates. Folders are named by role, not by employer,
so the public site does not disclose which companies are being applied to.

- producer/: Game Producer CV (new) + portfolio PDF moved from the root
- liveops/: LiveOps portfolio (web + PDF) and CV (PDF + DOCX), new
- brse/: BrSE 履歴書・職務経歴書 (PDF + DOCX), new
- game-designer/: commit the newer Drive versions already in the working tree
- root index.html stays the Producer web portfolio; Drive has no producer HTML

Producer portfolio PDF: kept the 23-page A4 export already in the repo over the
Drive copy, which is a single unpaginated page 825 x 8430 pt.

README: role-based link tables, and corrects the producer portfolio page count
from 8 to 23 (the earlier number came from grepping /Count and was wrong).

Co-Authored-By: Claude Opus 5 <noreply@anthropic.com>
</commit_message>
<xml_diff>
--- a/game-designer/HuynhThanhNghi_GameDesigner_CV.docx
+++ b/game-designer/HuynhThanhNghi_GameDesigner_CV.docx
@@ -203,41 +203,41 @@
           <w:sz w:val="20"/>
           <w:szCs w:val="20"/>
         </w:rPr>
-        <w:t xml:space="preserve">Grew from Game Designer / Operator to Lead Game Designer &amp; Project Manager at enish; now lead 8 designers inside a 26-person team, from concept through launch and live ops.</w:t>
-      </w:r>
-    </w:p>
-    <w:p>
-      <w:pPr>
-        <w:pStyle w:val="ListParagraph"/>
-        <w:numPr>
-          <w:ilvl w:val="0"/>
-          <w:numId w:val="2"/>
-        </w:numPr>
-        <w:spacing w:after="40"/>
-      </w:pPr>
-      <w:r>
-        <w:rPr>
-          <w:sz w:val="20"/>
-          <w:szCs w:val="20"/>
-        </w:rPr>
-        <w:t xml:space="preserve">Design decisions backed by data: D1 retention 44% → 73% after a playtest-driven training-loop redesign; D30 7% → 9–10% after a live RNG rebalance.</w:t>
-      </w:r>
-    </w:p>
-    <w:p>
-      <w:pPr>
-        <w:pStyle w:val="ListParagraph"/>
-        <w:numPr>
-          <w:ilvl w:val="0"/>
-          <w:numId w:val="2"/>
-        </w:numPr>
-        <w:spacing w:after="40"/>
-      </w:pPr>
-      <w:r>
-        <w:rPr>
-          <w:sz w:val="20"/>
-          <w:szCs w:val="20"/>
-        </w:rPr>
-        <w:t xml:space="preserve">Core craft: systems &amp; level design, GDD authoring, event/gacha economy design, KPI-driven live ops — plus AI agents that cut routine QA to under 10 min/day.</w:t>
+        <w:t xml:space="preserve">Grew from Game Designer / Operator to Lead Game Designer &amp; Project Manager at enish, leading 8 designers from concept through launch and live ops.</w:t>
+      </w:r>
+    </w:p>
+    <w:p>
+      <w:pPr>
+        <w:pStyle w:val="ListParagraph"/>
+        <w:numPr>
+          <w:ilvl w:val="0"/>
+          <w:numId w:val="2"/>
+        </w:numPr>
+        <w:spacing w:after="40"/>
+      </w:pPr>
+      <w:r>
+        <w:rPr>
+          <w:sz w:val="20"/>
+          <w:szCs w:val="20"/>
+        </w:rPr>
+        <w:t xml:space="preserve">Core craft: systems &amp; level design, GDD authoring, event/gacha economy design, and KPI-driven live ops.</w:t>
+      </w:r>
+    </w:p>
+    <w:p>
+      <w:pPr>
+        <w:pStyle w:val="ListParagraph"/>
+        <w:numPr>
+          <w:ilvl w:val="0"/>
+          <w:numId w:val="2"/>
+        </w:numPr>
+        <w:spacing w:after="40"/>
+      </w:pPr>
+      <w:r>
+        <w:rPr>
+          <w:sz w:val="20"/>
+          <w:szCs w:val="20"/>
+        </w:rPr>
+        <w:t xml:space="preserve">Design changes backed by data — e.g. D1 retention 44% → 73% after a playtest-driven redesign.</w:t>
       </w:r>
     </w:p>
     <w:p>
@@ -341,33 +341,7 @@
           <w:sz w:val="20"/>
           <w:szCs w:val="20"/>
         </w:rPr>
-        <w:t xml:space="preserve">Led 8 game designers within a 26-person team (plus outsourced partners) from concept to launch and live operations; design decisions directed the output of the UI, engineering and art teams.</w:t>
-      </w:r>
-    </w:p>
-    <w:p>
-      <w:pPr>
-        <w:pStyle w:val="ListParagraph"/>
-        <w:numPr>
-          <w:ilvl w:val="0"/>
-          <w:numId w:val="2"/>
-        </w:numPr>
-        <w:spacing w:after="40"/>
-      </w:pPr>
-      <w:r>
-        <w:rPr>
-          <w:b/>
-          <w:bCs/>
-          <w:sz w:val="20"/>
-          <w:szCs w:val="20"/>
-        </w:rPr>
-        <w:t xml:space="preserve">Production: </w:t>
-      </w:r>
-      <w:r>
-        <w:rPr>
-          <w:sz w:val="20"/>
-          <w:szCs w:val="20"/>
-        </w:rPr>
-        <w:t xml:space="preserve">Planned milestones and sprints; ran sprint planning, daily stand-ups and sprint retros; assigned and reviewed tasks; mentored VN and JP designers.</w:t>
+        <w:t xml:space="preserve">Led 8 designers in a 26-person team from concept to live ops, with sprint planning, stand-ups and retros.</w:t>
       </w:r>
     </w:p>
     <w:p>
@@ -393,85 +367,33 @@
           <w:sz w:val="20"/>
           <w:szCs w:val="20"/>
         </w:rPr>
-        <w:t xml:space="preserve">Owned the training simulation and race system from benchmark research (Uma Musume: Pretty Derby, Blue Lock: Project World Champion) and GDD to UI wireframes and shipped build; added new mechanics after test plays so the game stood apart from its benchmarks.</w:t>
-      </w:r>
-    </w:p>
-    <w:p>
-      <w:pPr>
-        <w:pStyle w:val="ListParagraph"/>
-        <w:numPr>
-          <w:ilvl w:val="0"/>
-          <w:numId w:val="2"/>
-        </w:numPr>
-        <w:spacing w:after="40"/>
-      </w:pPr>
-      <w:r>
-        <w:rPr>
-          <w:b/>
-          <w:bCs/>
-          <w:sz w:val="20"/>
-          <w:szCs w:val="20"/>
-        </w:rPr>
-        <w:t xml:space="preserve">Playtest-driven redesign: </w:t>
-      </w:r>
-      <w:r>
-        <w:rPr>
-          <w:sz w:val="20"/>
-          <w:szCs w:val="20"/>
-        </w:rPr>
-        <w:t xml:space="preserve">Cut the training cycle by two-thirds between test plays so players reached progression and new content faster — D1 retention rose from 44% to 73%.</w:t>
-      </w:r>
-    </w:p>
-    <w:p>
-      <w:pPr>
-        <w:pStyle w:val="ListParagraph"/>
-        <w:numPr>
-          <w:ilvl w:val="0"/>
-          <w:numId w:val="2"/>
-        </w:numPr>
-        <w:spacing w:after="40"/>
-      </w:pPr>
-      <w:r>
-        <w:rPr>
-          <w:b/>
-          <w:bCs/>
-          <w:sz w:val="20"/>
-          <w:szCs w:val="20"/>
-        </w:rPr>
-        <w:t xml:space="preserve">Balance fix: </w:t>
-      </w:r>
-      <w:r>
-        <w:rPr>
-          <w:sz w:val="20"/>
-          <w:szCs w:val="20"/>
-        </w:rPr>
-        <w:t xml:space="preserve">Traced D30 retention (7% vs. a 10–15% target) to late-game RNG that made training and purchases feel meaningless; rebalanced RNG to matter most in evenly matched races and fade as the power gap grows, backed by win-back campaigns — D30 rose to 9–10%.</w:t>
-      </w:r>
-    </w:p>
-    <w:p>
-      <w:pPr>
-        <w:pStyle w:val="ListParagraph"/>
-        <w:numPr>
-          <w:ilvl w:val="0"/>
-          <w:numId w:val="2"/>
-        </w:numPr>
-        <w:spacing w:after="40"/>
-      </w:pPr>
-      <w:r>
-        <w:rPr>
-          <w:b/>
-          <w:bCs/>
-          <w:sz w:val="20"/>
-          <w:szCs w:val="20"/>
-        </w:rPr>
-        <w:t xml:space="preserve">Content pacing: </w:t>
-      </w:r>
-      <w:r>
-        <w:rPr>
-          <w:sz w:val="20"/>
-          <w:szCs w:val="20"/>
-        </w:rPr>
-        <w:t xml:space="preserve">Sequenced content so players explore PvE and PvP first and Guild-vs-Guild follows two weeks after launch — kept the launch on track and matched how competitors pace players into competition.</w:t>
+        <w:t xml:space="preserve">Owned the training simulation and race system from benchmark research and GDD to wireframes and shipped build.</w:t>
+      </w:r>
+    </w:p>
+    <w:p>
+      <w:pPr>
+        <w:pStyle w:val="ListParagraph"/>
+        <w:numPr>
+          <w:ilvl w:val="0"/>
+          <w:numId w:val="2"/>
+        </w:numPr>
+        <w:spacing w:after="40"/>
+      </w:pPr>
+      <w:r>
+        <w:rPr>
+          <w:b/>
+          <w:bCs/>
+          <w:sz w:val="20"/>
+          <w:szCs w:val="20"/>
+        </w:rPr>
+        <w:t xml:space="preserve">Data-driven iteration: </w:t>
+      </w:r>
+      <w:r>
+        <w:rPr>
+          <w:sz w:val="20"/>
+          <w:szCs w:val="20"/>
+        </w:rPr>
+        <w:t xml:space="preserve">Tuned the core loop from playtests and live data — D1 44% → 73%, D30 7% → 9–10%.</w:t>
       </w:r>
     </w:p>
     <w:p>
@@ -497,59 +419,33 @@
           <w:sz w:val="20"/>
           <w:szCs w:val="20"/>
         </w:rPr>
-        <w:t xml:space="preserve">Designed training and race level progression; planned IAP packs and gacha lineups — the title holds the highest paying-user ratio of any enish title to date.</w:t>
-      </w:r>
-    </w:p>
-    <w:p>
-      <w:pPr>
-        <w:pStyle w:val="ListParagraph"/>
-        <w:numPr>
-          <w:ilvl w:val="0"/>
-          <w:numId w:val="2"/>
-        </w:numPr>
-        <w:spacing w:after="40"/>
-      </w:pPr>
-      <w:r>
-        <w:rPr>
-          <w:b/>
-          <w:bCs/>
-          <w:sz w:val="20"/>
-          <w:szCs w:val="20"/>
-        </w:rPr>
-        <w:t xml:space="preserve">IP &amp; art quality: </w:t>
-      </w:r>
-      <w:r>
-        <w:rPr>
-          <w:sz w:val="20"/>
-          <w:szCs w:val="20"/>
-        </w:rPr>
-        <w:t xml:space="preserve">Wrote the gacha illustration quality standard used with the IP holder, turning vague art feedback into review criteria; handled promotion and image-rights approvals.</w:t>
-      </w:r>
-    </w:p>
-    <w:p>
-      <w:pPr>
-        <w:pStyle w:val="ListParagraph"/>
-        <w:numPr>
-          <w:ilvl w:val="0"/>
-          <w:numId w:val="2"/>
-        </w:numPr>
-        <w:spacing w:after="40"/>
-      </w:pPr>
-      <w:r>
-        <w:rPr>
-          <w:b/>
-          <w:bCs/>
-          <w:sz w:val="20"/>
-          <w:szCs w:val="20"/>
-        </w:rPr>
-        <w:t xml:space="preserve">AI tools: </w:t>
-      </w:r>
-      <w:r>
-        <w:rPr>
-          <w:sz w:val="20"/>
-          <w:szCs w:val="20"/>
-        </w:rPr>
-        <w:t xml:space="preserve">Built AI agents for daily bug-checks on master data and code (routine QA check now under 10 min/day), master-data entry from level-design docs (zero doc-to-data mismatches), and consistent GDD formatting, doc review and reports.</w:t>
+        <w:t xml:space="preserve">Designed level progression, IAP packs and gacha lineups — the title holds the highest paying-user ratio of any enish title.</w:t>
+      </w:r>
+    </w:p>
+    <w:p>
+      <w:pPr>
+        <w:pStyle w:val="ListParagraph"/>
+        <w:numPr>
+          <w:ilvl w:val="0"/>
+          <w:numId w:val="2"/>
+        </w:numPr>
+        <w:spacing w:after="40"/>
+      </w:pPr>
+      <w:r>
+        <w:rPr>
+          <w:b/>
+          <w:bCs/>
+          <w:sz w:val="20"/>
+          <w:szCs w:val="20"/>
+        </w:rPr>
+        <w:t xml:space="preserve">Quality &amp; tools: </w:t>
+      </w:r>
+      <w:r>
+        <w:rPr>
+          <w:sz w:val="20"/>
+          <w:szCs w:val="20"/>
+        </w:rPr>
+        <w:t xml:space="preserve">Wrote the gacha art quality standard with the IP holder; built AI tools for QA and master data.</w:t>
       </w:r>
     </w:p>
     <w:p>
@@ -608,75 +504,41 @@
           <w:sz w:val="20"/>
           <w:szCs w:val="20"/>
         </w:rPr>
-        <w:t xml:space="preserve">Led the in-game (battle) team and new-feature development for the project.</w:t>
-      </w:r>
-    </w:p>
-    <w:p>
-      <w:pPr>
-        <w:pStyle w:val="ListParagraph"/>
-        <w:numPr>
-          <w:ilvl w:val="0"/>
-          <w:numId w:val="2"/>
-        </w:numPr>
-        <w:spacing w:after="40"/>
-      </w:pPr>
-      <w:r>
-        <w:rPr>
-          <w:sz w:val="20"/>
-          <w:szCs w:val="20"/>
-        </w:rPr>
-        <w:t xml:space="preserve">Owned the competitive modes (ranked PvP and GvG) end-to-end: GDD, development follow-through, launch and post-launch tuning; ranked seasons have run continuously since 12/2024.</w:t>
-      </w:r>
-    </w:p>
-    <w:p>
-      <w:pPr>
-        <w:pStyle w:val="ListParagraph"/>
-        <w:numPr>
-          <w:ilvl w:val="0"/>
-          <w:numId w:val="2"/>
-        </w:numPr>
-        <w:spacing w:after="40"/>
-      </w:pPr>
-      <w:r>
-        <w:rPr>
-          <w:sz w:val="20"/>
-          <w:szCs w:val="20"/>
-        </w:rPr>
-        <w:t xml:space="preserve">Designed 60+ stages (32 main-story, 12 daily, gold-farming, PvP and GvG arenas), plus monsters, bosses and character skills from concept to balancing — all shipped on schedule, with the art, sound and voice orders for each placed and managed by me.</w:t>
-      </w:r>
-    </w:p>
-    <w:p>
-      <w:pPr>
-        <w:pStyle w:val="ListParagraph"/>
-        <w:numPr>
-          <w:ilvl w:val="0"/>
-          <w:numId w:val="2"/>
-        </w:numPr>
-        <w:spacing w:after="40"/>
-      </w:pPr>
-      <w:r>
-        <w:rPr>
-          <w:sz w:val="20"/>
-          <w:szCs w:val="20"/>
-        </w:rPr>
-        <w:t xml:space="preserve">Served as the primary JP–VN liaison across the project lifecycle; trained new designers in both offices.</w:t>
-      </w:r>
-    </w:p>
-    <w:p>
-      <w:pPr>
-        <w:pStyle w:val="ListParagraph"/>
-        <w:numPr>
-          <w:ilvl w:val="0"/>
-          <w:numId w:val="2"/>
-        </w:numPr>
-        <w:spacing w:after="40"/>
-      </w:pPr>
-      <w:r>
-        <w:rPr>
-          <w:sz w:val="20"/>
-          <w:szCs w:val="20"/>
-        </w:rPr>
-        <w:t xml:space="preserve">Tuned battle feel with engineers in the in-house action-command system; directed BGM/SE/voice with sound designers.</w:t>
+        <w:t xml:space="preserve">Led the battle team; owned ranked PvP and GvG from GDD to live seasons, running continuously since 12/2024.</w:t>
+      </w:r>
+    </w:p>
+    <w:p>
+      <w:pPr>
+        <w:pStyle w:val="ListParagraph"/>
+        <w:numPr>
+          <w:ilvl w:val="0"/>
+          <w:numId w:val="2"/>
+        </w:numPr>
+        <w:spacing w:after="40"/>
+      </w:pPr>
+      <w:r>
+        <w:rPr>
+          <w:sz w:val="20"/>
+          <w:szCs w:val="20"/>
+        </w:rPr>
+        <w:t xml:space="preserve">Designed 60+ stages plus monsters, bosses and character skills from concept to balancing, all on schedule.</w:t>
+      </w:r>
+    </w:p>
+    <w:p>
+      <w:pPr>
+        <w:pStyle w:val="ListParagraph"/>
+        <w:numPr>
+          <w:ilvl w:val="0"/>
+          <w:numId w:val="2"/>
+        </w:numPr>
+        <w:spacing w:after="40"/>
+      </w:pPr>
+      <w:r>
+        <w:rPr>
+          <w:sz w:val="20"/>
+          <w:szCs w:val="20"/>
+        </w:rPr>
+        <w:t xml:space="preserve">Tuned battle feel with engineers and directed BGM/SE/voice; primary JP–VN liaison.</w:t>
       </w:r>
     </w:p>
     <w:p>
@@ -709,58 +571,24 @@
           <w:sz w:val="20"/>
           <w:szCs w:val="20"/>
         </w:rPr>
-        <w:t xml:space="preserve">Led the 4-person Vietnam team running live ops: event puzzles, gacha, campaigns, SNS and push notifications.</w:t>
-      </w:r>
-    </w:p>
-    <w:p>
-      <w:pPr>
-        <w:pStyle w:val="ListParagraph"/>
-        <w:numPr>
-          <w:ilvl w:val="0"/>
-          <w:numId w:val="2"/>
-        </w:numPr>
-        <w:spacing w:after="40"/>
-      </w:pPr>
-      <w:r>
-        <w:rPr>
-          <w:sz w:val="20"/>
-          <w:szCs w:val="20"/>
-        </w:rPr>
-        <w:t xml:space="preserve">Shipped an event every two weeks and a major campaign with a new or improved feature every quarter for 13 months with no missed release dates — idea to master data to release; wrote official release notes in Japanese.</w:t>
-      </w:r>
-    </w:p>
-    <w:p>
-      <w:pPr>
-        <w:pStyle w:val="ListParagraph"/>
-        <w:numPr>
-          <w:ilvl w:val="0"/>
-          <w:numId w:val="2"/>
-        </w:numPr>
-        <w:spacing w:after="40"/>
-      </w:pPr>
-      <w:r>
-        <w:rPr>
-          <w:sz w:val="20"/>
-          <w:szCs w:val="20"/>
-        </w:rPr>
-        <w:t xml:space="preserve">Designed event puzzle levels and set difficulty from live data (clear rate, completion, DAU, ARPPU).</w:t>
-      </w:r>
-    </w:p>
-    <w:p>
-      <w:pPr>
-        <w:pStyle w:val="ListParagraph"/>
-        <w:numPr>
-          <w:ilvl w:val="0"/>
-          <w:numId w:val="2"/>
-        </w:numPr>
-        <w:spacing w:after="40"/>
-      </w:pPr>
-      <w:r>
-        <w:rPr>
-          <w:sz w:val="20"/>
-          <w:szCs w:val="20"/>
-        </w:rPr>
-        <w:t xml:space="preserve">Shipped UI/UX improvements from competitive reference and wireframes through to release; worked on the "Cooking Raiha" idle-cooking system, which drew a strong positive player reaction on social media.</w:t>
+        <w:t xml:space="preserve">Led the 4-person Vietnam live-ops team: event puzzles, gacha, campaigns, SNS and push notifications.</w:t>
+      </w:r>
+    </w:p>
+    <w:p>
+      <w:pPr>
+        <w:pStyle w:val="ListParagraph"/>
+        <w:numPr>
+          <w:ilvl w:val="0"/>
+          <w:numId w:val="2"/>
+        </w:numPr>
+        <w:spacing w:after="40"/>
+      </w:pPr>
+      <w:r>
+        <w:rPr>
+          <w:sz w:val="20"/>
+          <w:szCs w:val="20"/>
+        </w:rPr>
+        <w:t xml:space="preserve">Held a two-week event and quarterly feature cadence for 13 months with no missed release dates; tuned puzzle difficulty from live data.</w:t>
       </w:r>
     </w:p>
     <w:p>
@@ -822,7 +650,7 @@
           <w:sz w:val="20"/>
           <w:szCs w:val="20"/>
         </w:rPr>
-        <w:t xml:space="preserve">2-person team (design + engineering): defined core gameplay, art direction and story; designed stages, monster behavior, player controls and lighting from prototype to release.</w:t>
+        <w:t xml:space="preserve">2-person team: defined core gameplay, art direction and story; designed stages, monster behavior and lighting.</w:t>
       </w:r>
     </w:p>
     <w:p>
@@ -865,7 +693,7 @@
           <w:sz w:val="20"/>
           <w:szCs w:val="20"/>
         </w:rPr>
-        <w:t xml:space="preserve">Solo rapid-prototyping exercise built in 4 hours: defined the core gameplay concept, design pillars, art direction and story background, then assembled a playable prototype using Unity assets and AI-assisted workflows.</w:t>
+        <w:t xml:space="preserve">4-hour solo prototype from concept and design pillars to a playable build.</w:t>
       </w:r>
     </w:p>
     <w:p>
@@ -910,7 +738,7 @@
           <w:sz w:val="20"/>
           <w:szCs w:val="20"/>
         </w:rPr>
-        <w:t xml:space="preserve">GDD authoring · systems &amp; combat design · level &amp; puzzle design · gacha/IAP economy · UI wireframing · playtest iteration</w:t>
+        <w:t xml:space="preserve">GDD authoring · systems &amp; combat design · level &amp; puzzle design · gacha/IAP economy · UI wireframing</w:t>
       </w:r>
     </w:p>
     <w:p>
@@ -988,7 +816,7 @@
           <w:sz w:val="20"/>
           <w:szCs w:val="20"/>
         </w:rPr>
-        <w:t xml:space="preserve">Figma · Unity · Redmine · Google Sheets · Cacoo · Excel · AI agents for QA, master data and documentation</w:t>
+        <w:t xml:space="preserve">Figma · Unity · Redmine · Google Sheets · Cacoo · Excel · AI agents</w:t>
       </w:r>
     </w:p>
     <w:p>

</xml_diff>